<commit_message>
Fix duplicate custom XML package entries in Word template
</commit_message>
<xml_diff>
--- a/word/Produktbeleg-Beispiel.docx
+++ b/word/Produktbeleg-Beispiel.docx
@@ -50,7 +50,7 @@
                 <w:tag w:val="id"/>
                 <w:id w:val="1001"/>
                 <w:text/>
-                <w:dataBinding w:storeItemID="{C78DFC51-85A7-4F9E-866E-9B4D603F2DF6}" w:xpath="/datensaetze/datensatz[1]/@id"/>
+                <w:dataBinding w:storeItemID="{12E4C26F-B7C1-4CA3-A2A2-12E333850B26}" w:xpath="/datensaetze/datensatz[1]/@id"/>
               </w:sdtPr>
               <w:sdtContent>
                 <w:r>
@@ -83,7 +83,7 @@
                 <w:tag w:val="vorname"/>
                 <w:id w:val="1002"/>
                 <w:text/>
-                <w:dataBinding w:storeItemID="{C78DFC51-85A7-4F9E-866E-9B4D603F2DF6}" w:xpath="/datensaetze/datensatz[1]/vorname"/>
+                <w:dataBinding w:storeItemID="{12E4C26F-B7C1-4CA3-A2A2-12E333850B26}" w:xpath="/datensaetze/datensatz[1]/vorname"/>
               </w:sdtPr>
               <w:sdtContent>
                 <w:r>
@@ -116,7 +116,7 @@
                 <w:tag w:val="nachname"/>
                 <w:id w:val="1003"/>
                 <w:text/>
-                <w:dataBinding w:storeItemID="{C78DFC51-85A7-4F9E-866E-9B4D603F2DF6}" w:xpath="/datensaetze/datensatz[1]/nachname"/>
+                <w:dataBinding w:storeItemID="{12E4C26F-B7C1-4CA3-A2A2-12E333850B26}" w:xpath="/datensaetze/datensatz[1]/nachname"/>
               </w:sdtPr>
               <w:sdtContent>
                 <w:r>
@@ -149,7 +149,7 @@
                 <w:tag w:val="produkt"/>
                 <w:id w:val="1004"/>
                 <w:text/>
-                <w:dataBinding w:storeItemID="{C78DFC51-85A7-4F9E-866E-9B4D603F2DF6}" w:xpath="/datensaetze/datensatz[1]/produkt"/>
+                <w:dataBinding w:storeItemID="{12E4C26F-B7C1-4CA3-A2A2-12E333850B26}" w:xpath="/datensaetze/datensatz[1]/produkt"/>
               </w:sdtPr>
               <w:sdtContent>
                 <w:r>
@@ -182,7 +182,7 @@
                 <w:tag w:val="preis"/>
                 <w:id w:val="1005"/>
                 <w:text/>
-                <w:dataBinding w:storeItemID="{C78DFC51-85A7-4F9E-866E-9B4D603F2DF6}" w:xpath="/datensaetze/datensatz[1]/preis"/>
+                <w:dataBinding w:storeItemID="{12E4C26F-B7C1-4CA3-A2A2-12E333850B26}" w:xpath="/datensaetze/datensatz[1]/preis"/>
               </w:sdtPr>
               <w:sdtContent>
                 <w:r>
@@ -215,7 +215,7 @@
                 <w:tag w:val="datum"/>
                 <w:id w:val="1006"/>
                 <w:text/>
-                <w:dataBinding w:storeItemID="{C78DFC51-85A7-4F9E-866E-9B4D603F2DF6}" w:xpath="/datensaetze/datensatz[1]/datum"/>
+                <w:dataBinding w:storeItemID="{12E4C26F-B7C1-4CA3-A2A2-12E333850B26}" w:xpath="/datensaetze/datensatz[1]/datum"/>
               </w:sdtPr>
               <w:sdtContent>
                 <w:r>
@@ -24430,7 +24430,7 @@
 </file>
 
 <file path=customXml/itemProps1.xml><?xml version="1.0" encoding="utf-8"?>
-<ds:datastoreItem xmlns:ds="http://schemas.openxmlformats.org/officeDocument/2006/customXml" ds:itemID="{C78DFC51-85A7-4F9E-866E-9B4D603F2DF6}">
+<ds:datastoreItem xmlns:ds="http://schemas.openxmlformats.org/officeDocument/2006/customXml" ds:itemID="{12E4C26F-B7C1-4CA3-A2A2-12E333850B26}">
   <ds:schemaRefs/>
 </ds:datastoreItem>
 </file>
</xml_diff>